<commit_message>
Word version: IEEE side-by-side author block, Times title, inline Abstract label
Co-Authored-By: Claude Opus 5.5 <noreply@anthropic.com>
Claude-Session: https://claude.ai/code/session_01Nh8NqBRgADQr4Ra3UNS94i
</commit_message>
<xml_diff>
--- a/paper/Agentic_Pilot_paper.docx
+++ b/paper/Agentic_Pilot_paper.docx
@@ -7,37 +7,136 @@
         <w:pStyle w:val="Title"/>
       </w:pPr>
       <w:r>
+        <w:rPr>
+          <w:rFonts w:ascii="Times New Roman" w:hAnsi="Times New Roman" w:cs="Times New Roman" w:eastAsia="Times New Roman"/>
+          <w:sz w:val="44"/>
+        </w:rPr>
         <w:t xml:space="preserve">Agentic Pilot: An Evidence-Driven Local Autonomous AI Agent Framework for Privacy-Preserving Intelligent Task Automation</w:t>
       </w:r>
     </w:p>
+    <w:tbl>
+      <w:tblPr>
+        <w:tblLayout w:type="autofit"/>
+        <w:tblLook w:firstColumn="1" w:firstRow="1" w:lastColumn="0" w:lastRow="0" w:noHBand="0" w:noVBand="1" w:val="04A0"/>
+        <w:tblBorders>
+          <w:top w:val="nil"/>
+          <w:left w:val="nil"/>
+          <w:bottom w:val="nil"/>
+          <w:right w:val="nil"/>
+          <w:insideH w:val="nil"/>
+          <w:insideV w:val="nil"/>
+        </w:tblBorders>
+        <w:jc w:val="center"/>
+        <w:tblW w:type="pct" w:w="5000"/>
+      </w:tblPr>
+      <w:tblGrid>
+        <w:gridCol w:w="5220"/>
+        <w:gridCol w:w="5220"/>
+      </w:tblGrid>
+      <w:tr>
+        <w:tc>
+          <w:tcPr>
+            <w:tcW w:type="dxa" w:w="5220"/>
+          </w:tcPr>
+          <w:p>
+            <w:pPr>
+              <w:spacing w:after="0" w:before="0"/>
+              <w:jc w:val="center"/>
+            </w:pPr>
+            <w:r/>
+            <w:r>
+              <w:rPr>
+                <w:rFonts w:ascii="Times New Roman" w:hAnsi="Times New Roman"/>
+                <w:sz w:val="22"/>
+              </w:rPr>
+              <w:t>Sudesh P</w:t>
+            </w:r>
+          </w:p>
+          <w:p>
+            <w:pPr>
+              <w:spacing w:after="0" w:before="0"/>
+              <w:jc w:val="center"/>
+            </w:pPr>
+            <w:r>
+              <w:rPr>
+                <w:rFonts w:ascii="Times New Roman" w:hAnsi="Times New Roman"/>
+                <w:sz w:val="20"/>
+              </w:rPr>
+              <w:t>SRM Institute of Science and Technology</w:t>
+            </w:r>
+          </w:p>
+          <w:p>
+            <w:pPr>
+              <w:spacing w:after="0" w:before="0"/>
+              <w:jc w:val="center"/>
+            </w:pPr>
+            <w:r>
+              <w:rPr>
+                <w:rFonts w:ascii="Times New Roman" w:hAnsi="Times New Roman"/>
+                <w:sz w:val="20"/>
+              </w:rPr>
+              <w:t>sp3782@srmist.edu.in</w:t>
+            </w:r>
+          </w:p>
+        </w:tc>
+        <w:tc>
+          <w:tcPr>
+            <w:tcW w:type="dxa" w:w="5220"/>
+          </w:tcPr>
+          <w:p>
+            <w:pPr>
+              <w:spacing w:after="0" w:before="0"/>
+              <w:jc w:val="center"/>
+            </w:pPr>
+            <w:r/>
+            <w:r>
+              <w:rPr>
+                <w:rFonts w:ascii="Times New Roman" w:hAnsi="Times New Roman"/>
+                <w:sz w:val="22"/>
+              </w:rPr>
+              <w:t>Dr. Kanchana M</w:t>
+            </w:r>
+          </w:p>
+          <w:p>
+            <w:pPr>
+              <w:spacing w:after="0" w:before="0"/>
+              <w:jc w:val="center"/>
+            </w:pPr>
+            <w:r>
+              <w:rPr>
+                <w:rFonts w:ascii="Times New Roman" w:hAnsi="Times New Roman"/>
+                <w:sz w:val="20"/>
+              </w:rPr>
+              <w:t>SRM Institute of Science and Technology</w:t>
+            </w:r>
+          </w:p>
+          <w:p>
+            <w:pPr>
+              <w:spacing w:after="0" w:before="0"/>
+              <w:jc w:val="center"/>
+            </w:pPr>
+            <w:r>
+              <w:rPr>
+                <w:rFonts w:ascii="Times New Roman" w:hAnsi="Times New Roman"/>
+                <w:sz w:val="20"/>
+              </w:rPr>
+              <w:t>kanchanm@srmist.edu.in</w:t>
+            </w:r>
+          </w:p>
+        </w:tc>
+      </w:tr>
+    </w:tbl>
     <w:p>
       <w:pPr>
-        <w:pStyle w:val="Author"/>
-      </w:pPr>
-      <w:r>
-        <w:t xml:space="preserve">Sudesh P, SRM Institute of Science and Technology, sp3782@srmist.edu.in</w:t>
-      </w:r>
-    </w:p>
-    <w:p>
-      <w:pPr>
-        <w:pStyle w:val="Author"/>
-      </w:pPr>
-      <w:r>
-        <w:t xml:space="preserve">Dr. Kanchana M, SRM Institute of Science and Technology, kanchanm@srmist.edu.in</w:t>
-      </w:r>
-    </w:p>
-    <w:p>
-      <w:pPr>
-        <w:pStyle w:val="AbstractTitle"/>
-      </w:pPr>
-      <w:r>
-        <w:t xml:space="preserve">Abstract</w:t>
-      </w:r>
-    </w:p>
-    <w:p>
-      <w:pPr>
         <w:pStyle w:val="Abstract"/>
       </w:pPr>
+      <w:r>
+        <w:rPr>
+          <w:b/>
+          <w:i/>
+        </w:rPr>
+        <w:t>Abstract—</w:t>
+      </w:r>
       <w:r>
         <w:t xml:space="preserve">Browser agents can report unfinished tasks as done, and many send every observation to a hosted model. Agentic Pilot is an open-source browser agent with local models that may report completion only when a rule-based predicate over the observed page holds, storing each decision’s inputs as evidence. We formalize this evidence-gated completion with false-completion and false-rejection rates and evaluate it at component level, in the agent’s real verification node with stubbed I/O. On 42 held-out constructed states frozen before testing, the gate withheld 9 of 22 unsatisfied states (95% interval 0.23–0.61) and rejected 1 of 20 satisfied ones. It was correct on more states than a dispatch-only rule (exact McNemar</w:t>
       </w:r>

</xml_diff>